<commit_message>
Fix empty pages and misplaced footer in generated contracts
- Fix final sectPr: w:bottom=0 w:footer=0 → w:bottom=960 w:footer=760
  to match other sections and prevent content overflow/footer overlap
- Add explicit footerReference (rId9/footer2.xml) to sections 2-4
  which previously relied on implicit inheritance, causing footer to
  disappear in some mobile renderers
- Fix footer2.xml: change positionV relativeFrom="page" to
  relativeFrom="bottomMargin" with recalculated Y offsets (0-247015 EMU)
  so mobile document viewers position footer elements correctly
  instead of treating the large page-relative Y values incorrectly

https://claude.ai/code/session_01FQ1bHu433kAcq2P61KJWhz
</commit_message>
<xml_diff>
--- a/template.docx
+++ b/template.docx
@@ -6949,6 +6949,7 @@
           <w:sz w:val="20"/>
         </w:rPr>
         <w:sectPr>
+          <w:footerReference w:type="default" r:id="rId9"/>
           <w:pgSz w:w="11910" w:h="16840"/>
           <w:pgMar w:top="520" w:right="420" w:bottom="960" w:left="720" w:header="0" w:footer="760" w:gutter="0"/>
           <w:cols w:space="720"/>
@@ -8878,6 +8879,7 @@
           <w:sz w:val="20"/>
         </w:rPr>
         <w:sectPr>
+          <w:footerReference w:type="default" r:id="rId9"/>
           <w:pgSz w:w="11910" w:h="16840"/>
           <w:pgMar w:top="520" w:right="420" w:bottom="960" w:left="720" w:header="0" w:footer="760" w:gutter="0"/>
           <w:cols w:space="720"/>
@@ -10078,6 +10080,7 @@
           <w:sz w:val="20"/>
         </w:rPr>
         <w:sectPr>
+          <w:footerReference w:type="default" r:id="rId9"/>
           <w:pgSz w:w="11910" w:h="16840"/>
           <w:pgMar w:top="520" w:right="420" w:bottom="960" w:left="720" w:header="0" w:footer="760" w:gutter="0"/>
           <w:cols w:space="720"/>
@@ -11325,9 +11328,9 @@
       </w:r>
     </w:p>
     <w:sectPr>
-      <w:footerReference w:type="default" r:id="rId10"/>
+      <w:footerReference w:type="default" r:id="rId9"/>
       <w:pgSz w:w="11910" w:h="16840"/>
-      <w:pgMar w:top="520" w:right="420" w:bottom="0" w:left="720" w:header="0" w:footer="0" w:gutter="0"/>
+      <w:pgMar w:top="520" w:right="420" w:bottom="960" w:left="720" w:header="0" w:footer="760" w:gutter="0"/>
       <w:cols w:space="720"/>
     </w:sectPr>
   </w:body>
@@ -11717,8 +11720,8 @@
               <wp:positionH relativeFrom="page">
                 <wp:posOffset>522605</wp:posOffset>
               </wp:positionH>
-              <wp:positionV relativeFrom="page">
-                <wp:posOffset>10082530</wp:posOffset>
+              <wp:positionV relativeFrom="bottomMargin">
+                <wp:posOffset>-1270</wp:posOffset>
               </wp:positionV>
               <wp:extent cx="6696710" cy="6350"/>
               <wp:effectExtent l="0" t="0" r="0" b="0"/>
@@ -11796,8 +11799,8 @@
               <wp:positionH relativeFrom="page">
                 <wp:posOffset>528320</wp:posOffset>
               </wp:positionH>
-              <wp:positionV relativeFrom="page">
-                <wp:posOffset>10087610</wp:posOffset>
+              <wp:positionV relativeFrom="bottomMargin">
+                <wp:posOffset>3810</wp:posOffset>
               </wp:positionV>
               <wp:extent cx="338455" cy="145415"/>
               <wp:effectExtent l="0" t="0" r="0" b="0"/>
@@ -11942,8 +11945,8 @@
               <wp:positionH relativeFrom="page">
                 <wp:posOffset>3460115</wp:posOffset>
               </wp:positionH>
-              <wp:positionV relativeFrom="page">
-                <wp:posOffset>10087610</wp:posOffset>
+              <wp:positionV relativeFrom="bottomMargin">
+                <wp:posOffset>3810</wp:posOffset>
               </wp:positionV>
               <wp:extent cx="544830" cy="145415"/>
               <wp:effectExtent l="0" t="0" r="0" b="0"/>
@@ -12100,8 +12103,8 @@
               <wp:positionH relativeFrom="page">
                 <wp:posOffset>6304915</wp:posOffset>
               </wp:positionH>
-              <wp:positionV relativeFrom="page">
-                <wp:posOffset>10087610</wp:posOffset>
+              <wp:positionV relativeFrom="bottomMargin">
+                <wp:posOffset>3810</wp:posOffset>
               </wp:positionV>
               <wp:extent cx="755015" cy="145415"/>
               <wp:effectExtent l="0" t="0" r="0" b="0"/>
@@ -12436,8 +12439,8 @@
               <wp:positionH relativeFrom="page">
                 <wp:posOffset>528320</wp:posOffset>
               </wp:positionH>
-              <wp:positionV relativeFrom="page">
-                <wp:posOffset>10325100</wp:posOffset>
+              <wp:positionV relativeFrom="bottomMargin">
+                <wp:posOffset>241300</wp:posOffset>
               </wp:positionV>
               <wp:extent cx="434340" cy="145415"/>
               <wp:effectExtent l="0" t="0" r="0" b="0"/>
@@ -12564,8 +12567,8 @@
               <wp:positionH relativeFrom="page">
                 <wp:posOffset>5603240</wp:posOffset>
               </wp:positionH>
-              <wp:positionV relativeFrom="page">
-                <wp:posOffset>10325100</wp:posOffset>
+              <wp:positionV relativeFrom="bottomMargin">
+                <wp:posOffset>241300</wp:posOffset>
               </wp:positionV>
               <wp:extent cx="1598930" cy="145415"/>
               <wp:effectExtent l="0" t="0" r="0" b="0"/>
@@ -12728,8 +12731,8 @@
               <wp:positionH relativeFrom="page">
                 <wp:posOffset>1005205</wp:posOffset>
               </wp:positionH>
-              <wp:positionV relativeFrom="page">
-                <wp:posOffset>10330815</wp:posOffset>
+              <wp:positionV relativeFrom="bottomMargin">
+                <wp:posOffset>247015</wp:posOffset>
               </wp:positionV>
               <wp:extent cx="1042035" cy="139065"/>
               <wp:effectExtent l="0" t="0" r="0" b="0"/>

</xml_diff>